<commit_message>
feat: configuracion dinamica de plantilla TUC en Google Docs, gestion de partida registral y mejoras en carga masiva
</commit_message>
<xml_diff>
--- a/backend/app/templates/plantilla_tuc.docx
+++ b/backend/app/templates/plantilla_tuc.docx
@@ -1409,8 +1409,9 @@
     <w:p>
       <w:pPr>
         <w:keepLines w:val="1"/>
-        <w:spacing w:line="72" w:lineRule="auto"/>
-        <w:jc w:val="center"/>
+        <w:spacing w:line="276" w:lineRule="auto"/>
+        <w:ind w:left="1984" w:right="2085"/>
+        <w:jc w:val="left"/>
         <w:rPr>
           <w:rFonts w:ascii="Roboto" w:cs="Roboto" w:eastAsia="Roboto" w:hAnsi="Roboto"/>
           <w:sz w:val="15"/>

</xml_diff>